<commit_message>
Rebuild Practical 4 report from reference format
</commit_message>
<xml_diff>
--- a/pract-4-awdf-24cs105.docx
+++ b/pract-4-awdf-24cs105.docx
@@ -1765,15 +1765,14 @@
             <w:pPr>
               <w:jc w:val="left"/>
             </w:pPr>
-            <w:r>
-              <w:t>GitHub Link Repository Link: https://github.com/24CS105-RUDRA/24CS105-AWDF-Practical4</w:t>
-            </w:r>
+            <w:r/>
             <w:r>
               <w:rPr>
                 <w:rFonts w:ascii="Times New Roman" w:hAnsi="Times New Roman"/>
                 <w:b/>
                 <w:sz w:val="22"/>
               </w:rPr>
+              <w:t xml:space="preserve">GitHub Link Repository Link: </w:t>
             </w:r>
             <w:r>
               <w:rPr>
@@ -1781,6 +1780,7 @@
                 <w:b/>
                 <w:sz w:val="22"/>
               </w:rPr>
+              <w:t>https://github.com/24CS105-RUDRA/24CS105-AWDF-Practical4</w:t>
             </w:r>
           </w:p>
         </w:tc>
@@ -2281,6 +2281,17 @@
           <w:szCs w:val="24"/>
         </w:rPr>
       </w:pPr>
+    </w:p>
+    <w:p>
+      <w:r>
+        <w:rPr>
+          <w:b/>
+        </w:rPr>
+        <w:t xml:space="preserve">Student Information: </w:t>
+      </w:r>
+      <w:r>
+        <w:t>Rudra Vaghela | ID: 24CS105 | Email: 24cs105@charusat.edu.in | Semester: 5th Sem | Program: B.Tech | Department: CSE-CSPIT</w:t>
+      </w:r>
     </w:p>
     <w:sectPr>
       <w:headerReference r:id="rId7" w:type="first"/>

</xml_diff>